<commit_message>
Add Questa-verified testbench for lane detection
</commit_message>
<xml_diff>
--- a/Project/Lane Detection using Sobel Filter/doc/Project_Concept_and_Block_Diagram.docx
+++ b/Project/Lane Detection using Sobel Filter/doc/Project_Concept_and_Block_Diagram.docx
@@ -130,11 +130,7 @@
         <w:t>esign Source Files</w:t>
       </w:r>
     </w:p>
-    <w:p>
-      <w:r>
-        <w:t>The VHDL design source files were renamed as follows:</w:t>
-      </w:r>
-    </w:p>
+    <w:p/>
     <w:tbl>
       <w:tblPr>
         <w:tblStyle w:val="TableGrid"/>

</xml_diff>